<commit_message>
justPipe3 26/09/2026 manual updated;
</commit_message>
<xml_diff>
--- a/project/_var/brochure/v3/justPipe3.docx
+++ b/project/_var/brochure/v3/justPipe3.docx
@@ -42,13 +42,16 @@
         <w:t xml:space="preserve">. </w:t>
       </w:r>
       <w:r>
-        <w:t xml:space="preserve">Contractual 24-hours final deliverables suggest that multibeam data are downloaded, processed and cleaned, product top digitized and seabed markers placed, digital video is reviewed and commented by inspection team, events places and aligned, listings are issued and all that is QC’ed by senior data processor and inspection coordinator. </w:t>
+        <w:t xml:space="preserve">Contractual 24-hours final deliverables suggest that multibeam data are downloaded, processed and cleaned, product top digitized and seabed markers placed, video is reviewed and, events places and aligned, listings are issued and all that is QC’ed by senior data processor and inspection coordinator. </w:t>
       </w:r>
       <w:r>
         <w:t>A</w:t>
       </w:r>
       <w:r>
-        <w:t xml:space="preserve"> lot of unpredicted things may influence processing performance</w:t>
+        <w:t xml:space="preserve"> lot of unpredicted things may influence </w:t>
+      </w:r>
+      <w:r>
+        <w:t>this process</w:t>
       </w:r>
       <w:r>
         <w:t xml:space="preserve"> though</w:t>
@@ -90,10 +93,22 @@
         <w:t xml:space="preserve"> and survey conditions, may not be controlled. Other things, such as software, workflow or human resources, are often limited by contract and client’s specifications, project budget and vessel capacity. </w:t>
       </w:r>
       <w:r>
-        <w:t>Often</w:t>
-      </w:r>
-      <w:r>
-        <w:t xml:space="preserve"> it turns out that processor may only manage his own performance.</w:t>
+        <w:t>I</w:t>
+      </w:r>
+      <w:r>
+        <w:t xml:space="preserve">t </w:t>
+      </w:r>
+      <w:r>
+        <w:t xml:space="preserve">often </w:t>
+      </w:r>
+      <w:r>
+        <w:t xml:space="preserve">turns out that processor </w:t>
+      </w:r>
+      <w:r>
+        <w:t>can</w:t>
+      </w:r>
+      <w:r>
+        <w:t xml:space="preserve"> only manage his own performance.</w:t>
       </w:r>
     </w:p>
     <w:p>
@@ -101,13 +116,31 @@
         <w:jc w:val="both"/>
       </w:pPr>
       <w:r>
-        <w:t xml:space="preserve">I would like to refer to </w:t>
+        <w:t xml:space="preserve">I would like to </w:t>
+      </w:r>
+      <w:r>
+        <w:t>dwell</w:t>
+      </w:r>
+      <w:r>
+        <w:t xml:space="preserve"> </w:t>
+      </w:r>
+      <w:r>
+        <w:t>on</w:t>
+      </w:r>
+      <w:r>
+        <w:t xml:space="preserve"> </w:t>
       </w:r>
       <w:r>
         <w:t>t</w:t>
       </w:r>
       <w:r>
-        <w:t xml:space="preserve">wo elements of the processing that we may try to improve. Software and workflow. We </w:t>
+        <w:t xml:space="preserve">wo elements of the processing that we </w:t>
+      </w:r>
+      <w:r>
+        <w:t>can</w:t>
+      </w:r>
+      <w:r>
+        <w:t xml:space="preserve"> try to improve. Software and workflow. We </w:t>
       </w:r>
       <w:r>
         <w:t>know</w:t>
@@ -197,7 +230,7 @@
         <w:t>ing</w:t>
       </w:r>
       <w:r>
-        <w:t xml:space="preserve"> manually if needed. This works fine if profiles quality is good and the product is well defined on the background seabed. Although, placing markers automatically may be a bit challenging. If the data is noisy, </w:t>
+        <w:t xml:space="preserve"> manually if needed. This works fine if profiles quality is good and the product is well defined on the background seabed. If the data is noisy, </w:t>
       </w:r>
       <w:r>
         <w:t>product is small or nearly buried, automatic processing often fails and processor must place TOP and markers</w:t>
@@ -206,13 +239,7 @@
         <w:t xml:space="preserve"> manually</w:t>
       </w:r>
       <w:r>
-        <w:t xml:space="preserve">. At this stage software interface and design plays important role. </w:t>
-      </w:r>
-      <w:r>
-        <w:t xml:space="preserve">Let us calculate. </w:t>
-      </w:r>
-      <w:r>
-        <w:t xml:space="preserve">If you digitize 3600m product at 1m interval, 1 second delay in a single profile processing will give 1 </w:t>
+        <w:t xml:space="preserve">. At this stage software interface and design plays important role. If you digitize 3600m product at 1m interval, 1 second delay in a single profile processing will give 1 </w:t>
       </w:r>
       <w:r>
         <w:t>lost</w:t>
@@ -271,6 +298,9 @@
         <w:t>y</w:t>
       </w:r>
       <w:r>
+        <w:t xml:space="preserve"> for manual processing</w:t>
+      </w:r>
+      <w:r>
         <w:t>.</w:t>
       </w:r>
     </w:p>
@@ -298,47 +328,50 @@
         <w:jc w:val="both"/>
       </w:pPr>
       <w:r>
+        <w:t xml:space="preserve">Thus, if we were going to develop a tool, helping to </w:t>
+      </w:r>
+      <w:r>
+        <w:t xml:space="preserve">speed-up processing we would try to </w:t>
+      </w:r>
+      <w:r>
+        <w:t>overcome those bottlenecks.</w:t>
+      </w:r>
+      <w:r>
+        <w:t xml:space="preserve"> </w:t>
+      </w:r>
+      <w:r>
+        <w:t>This</w:t>
+      </w:r>
+      <w:r>
+        <w:t xml:space="preserve"> </w:t>
+      </w:r>
+      <w:r>
+        <w:t>idea</w:t>
+      </w:r>
+      <w:r>
+        <w:t xml:space="preserve"> </w:t>
+      </w:r>
+      <w:r>
+        <w:t>underline</w:t>
+      </w:r>
+      <w:r>
+        <w:t>s</w:t>
+      </w:r>
+      <w:r>
+        <w:t xml:space="preserve"> justPipe software. </w:t>
+      </w:r>
+      <w:r>
+        <w:t>justPipe</w:t>
+      </w:r>
+      <w:r>
+        <w:t xml:space="preserve"> </w:t>
+      </w:r>
+      <w:r>
+        <w:t xml:space="preserve">is not a </w:t>
+      </w:r>
+      <w:r>
         <w:lastRenderedPageBreak/>
-        <w:t xml:space="preserve">Thus, if we were going to develop a tool, helping to </w:t>
-      </w:r>
-      <w:r>
-        <w:t xml:space="preserve">speed-up processing we would try to </w:t>
-      </w:r>
-      <w:r>
-        <w:t>overcome those bottlenecks.</w:t>
-      </w:r>
-      <w:r>
-        <w:t xml:space="preserve"> </w:t>
-      </w:r>
-      <w:r>
-        <w:t>This</w:t>
-      </w:r>
-      <w:r>
-        <w:t xml:space="preserve"> </w:t>
-      </w:r>
-      <w:r>
-        <w:t>idea</w:t>
-      </w:r>
-      <w:r>
-        <w:t xml:space="preserve"> </w:t>
-      </w:r>
-      <w:r>
-        <w:t>underline</w:t>
-      </w:r>
-      <w:r>
-        <w:t xml:space="preserve"> justPipe software. </w:t>
-      </w:r>
-      <w:r>
-        <w:t>justPipe</w:t>
-      </w:r>
-      <w:r>
-        <w:t xml:space="preserve"> </w:t>
-      </w:r>
-      <w:r>
-        <w:t>is not a substitute for the core processing software</w:t>
-      </w:r>
-      <w:r>
-        <w:t xml:space="preserve"> but it </w:t>
+        <w:t xml:space="preserve">substitute for the core processing software but it </w:t>
       </w:r>
       <w:r>
         <w:t>may</w:t>
@@ -366,13 +399,7 @@
         <w:jc w:val="both"/>
       </w:pPr>
       <w:r>
-        <w:t xml:space="preserve">When your </w:t>
-      </w:r>
-      <w:r>
-        <w:t>profiles are</w:t>
-      </w:r>
-      <w:r>
-        <w:t xml:space="preserve"> noisy and core software is unable to accurately place TOP and markers therefore you need to do a lot of manual work.</w:t>
+        <w:t>When your profiles are noisy and core software is unable to accurately place TOP and markers therefore you need to do a lot of manual work.</w:t>
       </w:r>
     </w:p>
     <w:p>
@@ -476,7 +503,13 @@
         <w:jc w:val="both"/>
       </w:pPr>
       <w:r>
-        <w:t>Thirdly, flexible pipetracker processing aiding is available. Statistical analysis helps to find the best fit of the product to pipetracker data. Once product top is snapped to pipetraker, markers will follow automatically.</w:t>
+        <w:t>Thirdly, flexible pipetracker processing aiding is available. Statistical analysis helps to find the best fit of the product to pipetracker data. Once product top is snapped to pipetraker, markers will follow</w:t>
+      </w:r>
+      <w:r>
+        <w:t xml:space="preserve"> it</w:t>
+      </w:r>
+      <w:r>
+        <w:t xml:space="preserve"> automatically.</w:t>
       </w:r>
     </w:p>
     <w:p>

</xml_diff>